<commit_message>
nice quarto configuration milestone
</commit_message>
<xml_diff>
--- a/scripts/quarto/reference.docx
+++ b/scripts/quarto/reference.docx
@@ -2,28 +2,400 @@
 <file path=word/document.xml><?xml version="1.0" encoding="utf-8"?>
 <w:document xmlns:wpc="http://schemas.microsoft.com/office/word/2010/wordprocessingCanvas" xmlns:cx="http://schemas.microsoft.com/office/drawing/2014/chartex" xmlns:cx1="http://schemas.microsoft.com/office/drawing/2015/9/8/chartex" xmlns:cx2="http://schemas.microsoft.com/office/drawing/2015/10/21/chartex" xmlns:cx3="http://schemas.microsoft.com/office/drawing/2016/5/9/chartex" xmlns:cx4="http://schemas.microsoft.com/office/drawing/2016/5/10/chartex" xmlns:cx5="http://schemas.microsoft.com/office/drawing/2016/5/11/chartex" xmlns:cx6="http://schemas.microsoft.com/office/drawing/2016/5/12/chartex" xmlns:cx7="http://schemas.microsoft.com/office/drawing/2016/5/13/chartex" xmlns:cx8="http://schemas.microsoft.com/office/drawing/2016/5/14/chartex" xmlns:mc="http://schemas.openxmlformats.org/markup-compatibility/2006" xmlns:aink="http://schemas.microsoft.com/office/drawing/2016/ink" xmlns:am3d="http://schemas.microsoft.com/office/drawing/2017/model3d" xmlns:o="urn:schemas-microsoft-com:office:office" xmlns:oel="http://schemas.microsoft.com/office/2019/extlst" xmlns:r="http://schemas.openxmlformats.org/officeDocument/2006/relationships" xmlns:m="http://schemas.openxmlformats.org/officeDocument/2006/math" xmlns:v="urn:schemas-microsoft-com:vml" xmlns:wp14="http://schemas.microsoft.com/office/word/2010/wordprocessingDrawing" xmlns:wp="http://schemas.openxmlformats.org/drawingml/2006/wordprocessingDrawing" xmlns:w10="urn:schemas-microsoft-com:office:word" xmlns:w="http://schemas.openxmlformats.org/wordprocessingml/2006/main" xmlns:w14="http://schemas.microsoft.com/office/word/2010/wordml" xmlns:w15="http://schemas.microsoft.com/office/word/2012/wordml" xmlns:w16cex="http://schemas.microsoft.com/office/word/2018/wordml/cex" xmlns:w16cid="http://schemas.microsoft.com/office/word/2016/wordml/cid" xmlns:w16="http://schemas.microsoft.com/office/word/2018/wordml" xmlns:w16du="http://schemas.microsoft.com/office/word/2023/wordml/word16du" xmlns:w16sdtdh="http://schemas.microsoft.com/office/word/2020/wordml/sdtdatahash" xmlns:w16sdtfl="http://schemas.microsoft.com/office/word/2024/wordml/sdtformatlock" xmlns:w16se="http://schemas.microsoft.com/office/word/2015/wordml/symex" xmlns:wpg="http://schemas.microsoft.com/office/word/2010/wordprocessingGroup" xmlns:wpi="http://schemas.microsoft.com/office/word/2010/wordprocessingInk" xmlns:wne="http://schemas.microsoft.com/office/word/2006/wordml" xmlns:wps="http://schemas.microsoft.com/office/word/2010/wordprocessingShape" mc:Ignorable="w14 w15 w16se w16cid w16 w16cex w16sdtdh w16sdtfl w16du wp14">
   <w:body>
+    <w:sdt>
+      <w:sdtPr>
+        <w:id w:val="227273369"/>
+        <w:docPartObj>
+          <w:docPartGallery w:val="Table of Contents"/>
+          <w:docPartUnique/>
+        </w:docPartObj>
+      </w:sdtPr>
+      <w:sdtEndPr>
+        <w:rPr>
+          <w:rFonts w:eastAsiaTheme="minorHAnsi" w:cs="Times New Roman"/>
+          <w:bCs/>
+          <w:color w:val="auto"/>
+          <w:kern w:val="2"/>
+          <w:sz w:val="24"/>
+          <w:szCs w:val="24"/>
+          <w:lang w:val="en-US" w:eastAsia="en-US"/>
+          <w14:ligatures w14:val="standardContextual"/>
+        </w:rPr>
+      </w:sdtEndPr>
+      <w:sdtContent>
+        <w:p>
+          <w:pPr>
+            <w:pStyle w:val="CabealhodoSumrio"/>
+            <w:rPr>
+              <w:u w:val="single"/>
+            </w:rPr>
+          </w:pPr>
+          <w:r>
+            <w:t>Sumário</w:t>
+          </w:r>
+        </w:p>
+        <w:p>
+          <w:pPr>
+            <w:pStyle w:val="Sumrio1"/>
+            <w:rPr>
+              <w:rFonts w:asciiTheme="minorHAnsi" w:eastAsiaTheme="minorEastAsia" w:hAnsiTheme="minorHAnsi" w:cstheme="minorBidi"/>
+              <w:b w:val="0"/>
+              <w:lang w:eastAsia="pt-BR"/>
+            </w:rPr>
+          </w:pPr>
+          <w:r>
+            <w:fldChar w:fldCharType="begin"/>
+          </w:r>
+          <w:r>
+            <w:instrText xml:space="preserve"> TOC \o "1-3" \h \z \u </w:instrText>
+          </w:r>
+          <w:r>
+            <w:fldChar w:fldCharType="separate"/>
+          </w:r>
+          <w:hyperlink w:anchor="_Toc212544452" w:history="1">
+            <w:r>
+              <w:rPr>
+                <w:rStyle w:val="Hyperlink"/>
+              </w:rPr>
+              <w:t>Título Nível 1</w:t>
+            </w:r>
+            <w:r>
+              <w:rPr>
+                <w:webHidden/>
+              </w:rPr>
+              <w:tab/>
+            </w:r>
+            <w:r>
+              <w:rPr>
+                <w:webHidden/>
+              </w:rPr>
+              <w:fldChar w:fldCharType="begin"/>
+            </w:r>
+            <w:r>
+              <w:rPr>
+                <w:webHidden/>
+              </w:rPr>
+              <w:instrText xml:space="preserve"> PAGEREF _Toc212544452 \h </w:instrText>
+            </w:r>
+            <w:r>
+              <w:rPr>
+                <w:webHidden/>
+              </w:rPr>
+            </w:r>
+            <w:r>
+              <w:rPr>
+                <w:webHidden/>
+              </w:rPr>
+              <w:fldChar w:fldCharType="separate"/>
+            </w:r>
+            <w:r>
+              <w:rPr>
+                <w:webHidden/>
+              </w:rPr>
+              <w:t>1</w:t>
+            </w:r>
+            <w:r>
+              <w:rPr>
+                <w:webHidden/>
+              </w:rPr>
+              <w:fldChar w:fldCharType="end"/>
+            </w:r>
+          </w:hyperlink>
+        </w:p>
+        <w:p>
+          <w:pPr>
+            <w:pStyle w:val="Sumrio2"/>
+            <w:rPr>
+              <w:rFonts w:asciiTheme="minorHAnsi" w:eastAsiaTheme="minorEastAsia" w:hAnsiTheme="minorHAnsi" w:cstheme="minorBidi"/>
+              <w:noProof/>
+              <w:lang w:val="pt-BR" w:eastAsia="pt-BR"/>
+            </w:rPr>
+          </w:pPr>
+          <w:hyperlink w:anchor="_Toc212544453" w:history="1">
+            <w:r>
+              <w:rPr>
+                <w:rStyle w:val="Hyperlink"/>
+                <w:noProof/>
+              </w:rPr>
+              <w:t>Título Nível 2</w:t>
+            </w:r>
+            <w:r>
+              <w:rPr>
+                <w:noProof/>
+                <w:webHidden/>
+              </w:rPr>
+              <w:tab/>
+            </w:r>
+            <w:r>
+              <w:rPr>
+                <w:noProof/>
+                <w:webHidden/>
+              </w:rPr>
+              <w:fldChar w:fldCharType="begin"/>
+            </w:r>
+            <w:r>
+              <w:rPr>
+                <w:noProof/>
+                <w:webHidden/>
+              </w:rPr>
+              <w:instrText xml:space="preserve"> PAGEREF _Toc212544453 \h </w:instrText>
+            </w:r>
+            <w:r>
+              <w:rPr>
+                <w:noProof/>
+                <w:webHidden/>
+              </w:rPr>
+            </w:r>
+            <w:r>
+              <w:rPr>
+                <w:noProof/>
+                <w:webHidden/>
+              </w:rPr>
+              <w:fldChar w:fldCharType="separate"/>
+            </w:r>
+            <w:r>
+              <w:rPr>
+                <w:noProof/>
+                <w:webHidden/>
+              </w:rPr>
+              <w:t>1</w:t>
+            </w:r>
+            <w:r>
+              <w:rPr>
+                <w:noProof/>
+                <w:webHidden/>
+              </w:rPr>
+              <w:fldChar w:fldCharType="end"/>
+            </w:r>
+          </w:hyperlink>
+        </w:p>
+        <w:p>
+          <w:pPr>
+            <w:pStyle w:val="Sumrio3"/>
+            <w:rPr>
+              <w:rFonts w:asciiTheme="minorHAnsi" w:eastAsiaTheme="minorEastAsia" w:hAnsiTheme="minorHAnsi" w:cstheme="minorBidi"/>
+              <w:noProof/>
+              <w:lang w:val="pt-BR" w:eastAsia="pt-BR"/>
+            </w:rPr>
+          </w:pPr>
+          <w:hyperlink w:anchor="_Toc212544454" w:history="1">
+            <w:r>
+              <w:rPr>
+                <w:rStyle w:val="Hyperlink"/>
+                <w:noProof/>
+              </w:rPr>
+              <w:t>Título Nível 3</w:t>
+            </w:r>
+            <w:r>
+              <w:rPr>
+                <w:noProof/>
+                <w:webHidden/>
+              </w:rPr>
+              <w:tab/>
+            </w:r>
+            <w:r>
+              <w:rPr>
+                <w:noProof/>
+                <w:webHidden/>
+              </w:rPr>
+              <w:fldChar w:fldCharType="begin"/>
+            </w:r>
+            <w:r>
+              <w:rPr>
+                <w:noProof/>
+                <w:webHidden/>
+              </w:rPr>
+              <w:instrText xml:space="preserve"> PAGEREF _Toc212544454 \h </w:instrText>
+            </w:r>
+            <w:r>
+              <w:rPr>
+                <w:noProof/>
+                <w:webHidden/>
+              </w:rPr>
+            </w:r>
+            <w:r>
+              <w:rPr>
+                <w:noProof/>
+                <w:webHidden/>
+              </w:rPr>
+              <w:fldChar w:fldCharType="separate"/>
+            </w:r>
+            <w:r>
+              <w:rPr>
+                <w:noProof/>
+                <w:webHidden/>
+              </w:rPr>
+              <w:t>1</w:t>
+            </w:r>
+            <w:r>
+              <w:rPr>
+                <w:noProof/>
+                <w:webHidden/>
+              </w:rPr>
+              <w:fldChar w:fldCharType="end"/>
+            </w:r>
+          </w:hyperlink>
+        </w:p>
+        <w:p>
+          <w:pPr>
+            <w:pStyle w:val="Sumrio1"/>
+            <w:rPr>
+              <w:rFonts w:asciiTheme="minorHAnsi" w:eastAsiaTheme="minorEastAsia" w:hAnsiTheme="minorHAnsi" w:cstheme="minorBidi"/>
+              <w:b w:val="0"/>
+              <w:lang w:eastAsia="pt-BR"/>
+            </w:rPr>
+          </w:pPr>
+          <w:hyperlink w:anchor="_Toc212544455" w:history="1">
+            <w:r>
+              <w:rPr>
+                <w:rStyle w:val="Hyperlink"/>
+              </w:rPr>
+              <w:t>Título Nível 1</w:t>
+            </w:r>
+            <w:r>
+              <w:rPr>
+                <w:webHidden/>
+              </w:rPr>
+              <w:tab/>
+            </w:r>
+            <w:r>
+              <w:rPr>
+                <w:webHidden/>
+              </w:rPr>
+              <w:fldChar w:fldCharType="begin"/>
+            </w:r>
+            <w:r>
+              <w:rPr>
+                <w:webHidden/>
+              </w:rPr>
+              <w:instrText xml:space="preserve"> PAGEREF _Toc212544455 \h </w:instrText>
+            </w:r>
+            <w:r>
+              <w:rPr>
+                <w:webHidden/>
+              </w:rPr>
+            </w:r>
+            <w:r>
+              <w:rPr>
+                <w:webHidden/>
+              </w:rPr>
+              <w:fldChar w:fldCharType="separate"/>
+            </w:r>
+            <w:r>
+              <w:rPr>
+                <w:webHidden/>
+              </w:rPr>
+              <w:t>2</w:t>
+            </w:r>
+            <w:r>
+              <w:rPr>
+                <w:webHidden/>
+              </w:rPr>
+              <w:fldChar w:fldCharType="end"/>
+            </w:r>
+          </w:hyperlink>
+        </w:p>
+        <w:p>
+          <w:pPr>
+            <w:pStyle w:val="Sumrio2"/>
+            <w:rPr>
+              <w:rFonts w:asciiTheme="minorHAnsi" w:eastAsiaTheme="minorEastAsia" w:hAnsiTheme="minorHAnsi" w:cstheme="minorBidi"/>
+              <w:noProof/>
+              <w:lang w:val="pt-BR" w:eastAsia="pt-BR"/>
+            </w:rPr>
+          </w:pPr>
+          <w:hyperlink w:anchor="_Toc212544456" w:history="1">
+            <w:r>
+              <w:rPr>
+                <w:rStyle w:val="Hyperlink"/>
+                <w:noProof/>
+              </w:rPr>
+              <w:t>Título Nível 2:</w:t>
+            </w:r>
+            <w:r>
+              <w:rPr>
+                <w:noProof/>
+                <w:webHidden/>
+              </w:rPr>
+              <w:tab/>
+            </w:r>
+            <w:r>
+              <w:rPr>
+                <w:noProof/>
+                <w:webHidden/>
+              </w:rPr>
+              <w:fldChar w:fldCharType="begin"/>
+            </w:r>
+            <w:r>
+              <w:rPr>
+                <w:noProof/>
+                <w:webHidden/>
+              </w:rPr>
+              <w:instrText xml:space="preserve"> PAGEREF _Toc212544456 \h </w:instrText>
+            </w:r>
+            <w:r>
+              <w:rPr>
+                <w:noProof/>
+                <w:webHidden/>
+              </w:rPr>
+            </w:r>
+            <w:r>
+              <w:rPr>
+                <w:noProof/>
+                <w:webHidden/>
+              </w:rPr>
+              <w:fldChar w:fldCharType="separate"/>
+            </w:r>
+            <w:r>
+              <w:rPr>
+                <w:noProof/>
+                <w:webHidden/>
+              </w:rPr>
+              <w:t>2</w:t>
+            </w:r>
+            <w:r>
+              <w:rPr>
+                <w:noProof/>
+                <w:webHidden/>
+              </w:rPr>
+              <w:fldChar w:fldCharType="end"/>
+            </w:r>
+          </w:hyperlink>
+        </w:p>
+        <w:p>
+          <w:r>
+            <w:rPr>
+              <w:b/>
+              <w:bCs/>
+            </w:rPr>
+            <w:fldChar w:fldCharType="end"/>
+          </w:r>
+        </w:p>
+      </w:sdtContent>
+    </w:sdt>
     <w:p>
       <w:pPr>
-        <w:pStyle w:val="Ttulo1"/>
-      </w:pPr>
-      <w:proofErr w:type="spellStart"/>
-      <w:r>
-        <w:t>Título</w:t>
-      </w:r>
-      <w:proofErr w:type="spellEnd"/>
-      <w:r>
-        <w:t xml:space="preserve"> </w:t>
-      </w:r>
-      <w:proofErr w:type="spellStart"/>
-      <w:r>
-        <w:t>Nível</w:t>
-      </w:r>
-      <w:proofErr w:type="spellEnd"/>
-      <w:r>
-        <w:t xml:space="preserve"> 1</w:t>
+        <w:pStyle w:val="Sumrio1"/>
+      </w:pPr>
+      <w:r>
+        <w:fldChar w:fldCharType="begin"/>
+      </w:r>
+      <w:r>
+        <w:instrText xml:space="preserve"> TOC \o "1-3" \h \z \u </w:instrText>
+      </w:r>
+      <w:r>
+        <w:fldChar w:fldCharType="separate"/>
+      </w:r>
+      <w:r>
+        <w:fldChar w:fldCharType="end"/>
       </w:r>
     </w:p>
     <w:p>
+      <w:pPr>
+        <w:rPr>
+          <w:lang w:val="pt-BR"/>
+        </w:rPr>
+      </w:pPr>
       <w:r>
         <w:t xml:space="preserve">Lorem ipsum dolor sit </w:t>
       </w:r>
@@ -57,7 +429,10 @@
       </w:r>
       <w:proofErr w:type="spellEnd"/>
       <w:r>
-        <w:t xml:space="preserve">. Duis </w:t>
+        <w:t xml:space="preserve">. </w:t>
+      </w:r>
+      <w:r>
+        <w:t xml:space="preserve">Duis </w:t>
       </w:r>
       <w:proofErr w:type="spellStart"/>
       <w:r>
@@ -161,324 +536,132 @@
       </w:r>
       <w:proofErr w:type="spellEnd"/>
       <w:r>
-        <w:t xml:space="preserve"> a mi. Aenean vitae ipsum eros. Vestibulum </w:t>
+        <w:t xml:space="preserve"> a mi. </w:t>
       </w:r>
       <w:proofErr w:type="spellStart"/>
       <w:r>
-        <w:t>ut</w:t>
+        <w:rPr>
+          <w:lang w:val="pt-BR"/>
+        </w:rPr>
+        <w:t>Aenean</w:t>
       </w:r>
       <w:proofErr w:type="spellEnd"/>
       <w:r>
+        <w:rPr>
+          <w:lang w:val="pt-BR"/>
+        </w:rPr>
+        <w:t xml:space="preserve"> vitae ipsum </w:t>
+      </w:r>
+      <w:proofErr w:type="spellStart"/>
+      <w:r>
+        <w:rPr>
+          <w:lang w:val="pt-BR"/>
+        </w:rPr>
+        <w:t>eros</w:t>
+      </w:r>
+      <w:proofErr w:type="spellEnd"/>
+      <w:r>
+        <w:rPr>
+          <w:lang w:val="pt-BR"/>
+        </w:rPr>
+        <w:t xml:space="preserve">. </w:t>
+      </w:r>
+      <w:proofErr w:type="spellStart"/>
+      <w:r>
+        <w:rPr>
+          <w:lang w:val="pt-BR"/>
+        </w:rPr>
+        <w:t>Vestibulum</w:t>
+      </w:r>
+      <w:proofErr w:type="spellEnd"/>
+      <w:r>
+        <w:rPr>
+          <w:lang w:val="pt-BR"/>
+        </w:rPr>
+        <w:t xml:space="preserve"> ut </w:t>
+      </w:r>
+      <w:proofErr w:type="spellStart"/>
+      <w:r>
+        <w:rPr>
+          <w:lang w:val="pt-BR"/>
+        </w:rPr>
+        <w:t>mollis</w:t>
+      </w:r>
+      <w:proofErr w:type="spellEnd"/>
+      <w:r>
+        <w:rPr>
+          <w:lang w:val="pt-BR"/>
+        </w:rPr>
         <w:t xml:space="preserve"> </w:t>
       </w:r>
       <w:proofErr w:type="spellStart"/>
       <w:r>
-        <w:t>mollis</w:t>
+        <w:rPr>
+          <w:lang w:val="pt-BR"/>
+        </w:rPr>
+        <w:t>lectus</w:t>
       </w:r>
       <w:proofErr w:type="spellEnd"/>
       <w:r>
-        <w:t xml:space="preserve"> </w:t>
-      </w:r>
-      <w:proofErr w:type="spellStart"/>
-      <w:r>
-        <w:t>lectus</w:t>
-      </w:r>
-      <w:proofErr w:type="spellEnd"/>
-      <w:r>
+        <w:rPr>
+          <w:lang w:val="pt-BR"/>
+        </w:rPr>
         <w:t xml:space="preserve">. </w:t>
       </w:r>
     </w:p>
     <w:p>
-      <w:r>
-        <w:t xml:space="preserve">Ut lacinia </w:t>
+      <w:pPr>
+        <w:rPr>
+          <w:lang w:val="pt-BR"/>
+        </w:rPr>
+      </w:pPr>
+      <w:r>
+        <w:rPr>
+          <w:lang w:val="pt-BR"/>
+        </w:rPr>
+        <w:t xml:space="preserve">Ut </w:t>
       </w:r>
       <w:proofErr w:type="spellStart"/>
       <w:r>
-        <w:t>augue</w:t>
+        <w:rPr>
+          <w:lang w:val="pt-BR"/>
+        </w:rPr>
+        <w:t>lacinia</w:t>
       </w:r>
       <w:proofErr w:type="spellEnd"/>
       <w:r>
-        <w:t xml:space="preserve"> vel </w:t>
+        <w:rPr>
+          <w:lang w:val="pt-BR"/>
+        </w:rPr>
+        <w:t xml:space="preserve"> augue </w:t>
       </w:r>
       <w:proofErr w:type="spellStart"/>
       <w:r>
+        <w:rPr>
+          <w:lang w:val="pt-BR"/>
+        </w:rPr>
+        <w:t>vel</w:t>
+      </w:r>
+      <w:proofErr w:type="spellEnd"/>
+      <w:r>
+        <w:rPr>
+          <w:lang w:val="pt-BR"/>
+        </w:rPr>
+        <w:t xml:space="preserve"> </w:t>
+      </w:r>
+      <w:proofErr w:type="spellStart"/>
+      <w:r>
+        <w:rPr>
+          <w:lang w:val="pt-BR"/>
+        </w:rPr>
         <w:t>enim</w:t>
       </w:r>
       <w:proofErr w:type="spellEnd"/>
       <w:r>
-        <w:t xml:space="preserve"> dictum </w:t>
-      </w:r>
-      <w:proofErr w:type="spellStart"/>
-      <w:r>
-        <w:t>imperdiet</w:t>
-      </w:r>
-      <w:proofErr w:type="spellEnd"/>
-      <w:r>
-        <w:t xml:space="preserve">. Vestibulum id libero vitae </w:t>
-      </w:r>
-      <w:proofErr w:type="spellStart"/>
-      <w:r>
-        <w:t>sem</w:t>
-      </w:r>
-      <w:proofErr w:type="spellEnd"/>
-      <w:r>
-        <w:t xml:space="preserve"> lacinia </w:t>
-      </w:r>
-      <w:proofErr w:type="spellStart"/>
-      <w:r>
-        <w:t>posuere</w:t>
-      </w:r>
-      <w:proofErr w:type="spellEnd"/>
-      <w:r>
-        <w:t xml:space="preserve"> ac </w:t>
-      </w:r>
-      <w:proofErr w:type="spellStart"/>
-      <w:r>
-        <w:t>hendrerit</w:t>
-      </w:r>
-      <w:proofErr w:type="spellEnd"/>
-      <w:r>
-        <w:t xml:space="preserve"> </w:t>
-      </w:r>
-      <w:proofErr w:type="spellStart"/>
-      <w:r>
-        <w:t>lacus</w:t>
-      </w:r>
-      <w:proofErr w:type="spellEnd"/>
-      <w:r>
-        <w:t xml:space="preserve">. Donec </w:t>
-      </w:r>
-      <w:proofErr w:type="spellStart"/>
-      <w:r>
-        <w:t>hendrerit</w:t>
-      </w:r>
-      <w:proofErr w:type="spellEnd"/>
-      <w:r>
-        <w:t xml:space="preserve"> </w:t>
-      </w:r>
-      <w:proofErr w:type="spellStart"/>
-      <w:r>
-        <w:t>tempor</w:t>
-      </w:r>
-      <w:proofErr w:type="spellEnd"/>
-      <w:r>
-        <w:t xml:space="preserve"> </w:t>
-      </w:r>
-      <w:proofErr w:type="spellStart"/>
-      <w:r>
-        <w:t>ullamcorper</w:t>
-      </w:r>
-      <w:proofErr w:type="spellEnd"/>
-      <w:r>
-        <w:t xml:space="preserve">. Vestibulum ante ipsum </w:t>
-      </w:r>
-      <w:proofErr w:type="spellStart"/>
-      <w:r>
-        <w:t>primis</w:t>
-      </w:r>
-      <w:proofErr w:type="spellEnd"/>
-      <w:r>
-        <w:t xml:space="preserve"> in </w:t>
-      </w:r>
-      <w:proofErr w:type="spellStart"/>
-      <w:r>
-        <w:t>faucibus</w:t>
-      </w:r>
-      <w:proofErr w:type="spellEnd"/>
-      <w:r>
-        <w:t xml:space="preserve"> </w:t>
-      </w:r>
-      <w:proofErr w:type="spellStart"/>
-      <w:r>
-        <w:t>orci</w:t>
-      </w:r>
-      <w:proofErr w:type="spellEnd"/>
-      <w:r>
-        <w:t xml:space="preserve"> </w:t>
-      </w:r>
-      <w:proofErr w:type="spellStart"/>
-      <w:r>
-        <w:t>luctus</w:t>
-      </w:r>
-      <w:proofErr w:type="spellEnd"/>
-      <w:r>
-        <w:t xml:space="preserve"> et </w:t>
-      </w:r>
-      <w:proofErr w:type="spellStart"/>
-      <w:r>
-        <w:t>ultrices</w:t>
-      </w:r>
-      <w:proofErr w:type="spellEnd"/>
-      <w:r>
-        <w:t xml:space="preserve"> </w:t>
-      </w:r>
-      <w:proofErr w:type="spellStart"/>
-      <w:r>
-        <w:t>posuere</w:t>
-      </w:r>
-      <w:proofErr w:type="spellEnd"/>
-      <w:r>
-        <w:t xml:space="preserve"> </w:t>
-      </w:r>
-      <w:proofErr w:type="spellStart"/>
-      <w:r>
-        <w:t>cubilia</w:t>
-      </w:r>
-      <w:proofErr w:type="spellEnd"/>
-      <w:r>
-        <w:t xml:space="preserve"> curae; </w:t>
-      </w:r>
-      <w:proofErr w:type="spellStart"/>
-      <w:r>
-        <w:t>Aliquam</w:t>
-      </w:r>
-      <w:proofErr w:type="spellEnd"/>
-      <w:r>
-        <w:t xml:space="preserve"> </w:t>
-      </w:r>
-      <w:proofErr w:type="spellStart"/>
-      <w:r>
-        <w:t>varius</w:t>
-      </w:r>
-      <w:proofErr w:type="spellEnd"/>
-      <w:r>
-        <w:t xml:space="preserve"> </w:t>
-      </w:r>
-      <w:proofErr w:type="spellStart"/>
-      <w:r>
-        <w:t>urna</w:t>
-      </w:r>
-      <w:proofErr w:type="spellEnd"/>
-      <w:r>
-        <w:t xml:space="preserve"> </w:t>
-      </w:r>
-      <w:proofErr w:type="spellStart"/>
-      <w:r>
-        <w:t>volutpat</w:t>
-      </w:r>
-      <w:proofErr w:type="spellEnd"/>
-      <w:r>
-        <w:t xml:space="preserve">, porta eros id, </w:t>
-      </w:r>
-      <w:proofErr w:type="spellStart"/>
-      <w:r>
-        <w:t>pretium</w:t>
-      </w:r>
-      <w:proofErr w:type="spellEnd"/>
-      <w:r>
-        <w:t xml:space="preserve"> dolor. </w:t>
-      </w:r>
-      <w:proofErr w:type="spellStart"/>
-      <w:r>
-        <w:t>Fusce</w:t>
-      </w:r>
-      <w:proofErr w:type="spellEnd"/>
-      <w:r>
-        <w:t xml:space="preserve"> </w:t>
-      </w:r>
-      <w:proofErr w:type="spellStart"/>
-      <w:r>
-        <w:t>ut</w:t>
-      </w:r>
-      <w:proofErr w:type="spellEnd"/>
-      <w:r>
-        <w:t xml:space="preserve"> ligula libero. Sed at </w:t>
-      </w:r>
-      <w:proofErr w:type="spellStart"/>
-      <w:r>
-        <w:t>finibus</w:t>
-      </w:r>
-      <w:proofErr w:type="spellEnd"/>
-      <w:r>
-        <w:t xml:space="preserve"> diam, ac </w:t>
-      </w:r>
-      <w:proofErr w:type="spellStart"/>
-      <w:r>
-        <w:t>hendrerit</w:t>
-      </w:r>
-      <w:proofErr w:type="spellEnd"/>
-      <w:r>
-        <w:t xml:space="preserve"> sem. Nunc </w:t>
-      </w:r>
-      <w:proofErr w:type="spellStart"/>
-      <w:r>
-        <w:t>condimentum</w:t>
-      </w:r>
-      <w:proofErr w:type="spellEnd"/>
-      <w:r>
-        <w:t xml:space="preserve">, </w:t>
-      </w:r>
-      <w:proofErr w:type="spellStart"/>
-      <w:r>
-        <w:t>purus</w:t>
-      </w:r>
-      <w:proofErr w:type="spellEnd"/>
-      <w:r>
-        <w:t xml:space="preserve"> in </w:t>
-      </w:r>
-      <w:proofErr w:type="spellStart"/>
-      <w:r>
-        <w:t>imperdiet</w:t>
-      </w:r>
-      <w:proofErr w:type="spellEnd"/>
-      <w:r>
-        <w:t xml:space="preserve"> </w:t>
-      </w:r>
-      <w:proofErr w:type="spellStart"/>
-      <w:r>
-        <w:t>finibus</w:t>
-      </w:r>
-      <w:proofErr w:type="spellEnd"/>
-      <w:r>
-        <w:t xml:space="preserve">, </w:t>
-      </w:r>
-      <w:proofErr w:type="spellStart"/>
-      <w:r>
-        <w:t>neque</w:t>
-      </w:r>
-      <w:proofErr w:type="spellEnd"/>
-      <w:r>
-        <w:t xml:space="preserve"> </w:t>
-      </w:r>
-      <w:proofErr w:type="spellStart"/>
-      <w:r>
-        <w:t>enim</w:t>
-      </w:r>
-      <w:proofErr w:type="spellEnd"/>
-      <w:r>
-        <w:t xml:space="preserve"> </w:t>
-      </w:r>
-      <w:proofErr w:type="spellStart"/>
-      <w:r>
-        <w:t>suscipit</w:t>
-      </w:r>
-      <w:proofErr w:type="spellEnd"/>
-      <w:r>
-        <w:t xml:space="preserve"> ligula, </w:t>
-      </w:r>
-      <w:proofErr w:type="spellStart"/>
-      <w:r>
-        <w:t>eget</w:t>
-      </w:r>
-      <w:proofErr w:type="spellEnd"/>
-      <w:r>
-        <w:t xml:space="preserve"> vestibulum ante </w:t>
-      </w:r>
-      <w:proofErr w:type="spellStart"/>
-      <w:r>
-        <w:t>erat</w:t>
-      </w:r>
-      <w:proofErr w:type="spellEnd"/>
-      <w:r>
-        <w:t xml:space="preserve"> </w:t>
-      </w:r>
-      <w:proofErr w:type="spellStart"/>
-      <w:r>
-        <w:t>ut</w:t>
-      </w:r>
-      <w:proofErr w:type="spellEnd"/>
-      <w:r>
-        <w:t xml:space="preserve"> diam.</w:t>
+        <w:rPr>
+          <w:lang w:val="pt-BR"/>
+        </w:rPr>
+        <w:t xml:space="preserve"> dictum imperdiet. Vestibulum id libero vitae sem lacinia posuere ac hendrerit lacus. Donec hendrerit tempor ullamcorper. Vestibulum ante ipsum primis in faucibus orci luctus et ultrices posuere cubilia curae; Aliquam varius urna volutpat, porta eros id, pretium dolor. Fusce ut ligula libero. Sed at finibus diam, ac hendrerit sem. Nunc condimentum, purus in imperdiet finibus, neque enim suscipit ligula, eget vestibulum ante erat ut diam.</w:t>
       </w:r>
     </w:p>
     <w:p>
@@ -539,52 +722,75 @@
     <w:p>
       <w:pPr>
         <w:pStyle w:val="Legenda"/>
+        <w:rPr>
+          <w:lang w:val="pt-BR"/>
+        </w:rPr>
       </w:pPr>
       <w:bookmarkStart w:id="0" w:name="_Toc212498932"/>
       <w:r>
+        <w:rPr>
+          <w:lang w:val="pt-BR"/>
+        </w:rPr>
         <w:t xml:space="preserve">Figura </w:t>
       </w:r>
-      <w:fldSimple w:instr=" SEQ Figura \* ARABIC ">
-        <w:r>
-          <w:t>1</w:t>
-        </w:r>
-        <w:bookmarkEnd w:id="0"/>
-      </w:fldSimple>
+      <w:r>
+        <w:fldChar w:fldCharType="begin"/>
+      </w:r>
+      <w:r>
+        <w:rPr>
+          <w:lang w:val="pt-BR"/>
+        </w:rPr>
+        <w:instrText xml:space="preserve"> SEQ Figura \* ARABIC </w:instrText>
+      </w:r>
+      <w:r>
+        <w:fldChar w:fldCharType="separate"/>
+      </w:r>
+      <w:r>
+        <w:rPr>
+          <w:lang w:val="pt-BR"/>
+        </w:rPr>
+        <w:t>1</w:t>
+      </w:r>
+      <w:bookmarkEnd w:id="0"/>
+      <w:r>
+        <w:fldChar w:fldCharType="end"/>
+      </w:r>
     </w:p>
     <w:p>
       <w:pPr>
         <w:pStyle w:val="Ttulo1"/>
-        <w:rPr>
-          <w:lang w:val="pt-BR"/>
-        </w:rPr>
-      </w:pPr>
-      <w:r>
-        <w:rPr>
-          <w:lang w:val="pt-BR"/>
-        </w:rPr>
+      </w:pPr>
+      <w:bookmarkStart w:id="1" w:name="_Toc212543590"/>
+      <w:bookmarkStart w:id="2" w:name="_Toc212543681"/>
+      <w:bookmarkStart w:id="3" w:name="_Toc212544444"/>
+      <w:bookmarkStart w:id="4" w:name="_Toc212544452"/>
+      <w:r>
         <w:t>Título Nível 1</w:t>
       </w:r>
+      <w:bookmarkEnd w:id="1"/>
+      <w:bookmarkEnd w:id="2"/>
+      <w:bookmarkEnd w:id="3"/>
+      <w:bookmarkEnd w:id="4"/>
     </w:p>
     <w:p>
       <w:pPr>
         <w:pStyle w:val="Ttulo2"/>
         <w:ind w:hanging="567"/>
-        <w:rPr>
-          <w:lang w:val="pt-BR"/>
-        </w:rPr>
-      </w:pPr>
-      <w:r>
-        <w:rPr>
-          <w:lang w:val="pt-BR"/>
-        </w:rPr>
+      </w:pPr>
+      <w:bookmarkStart w:id="5" w:name="_Toc212543591"/>
+      <w:bookmarkStart w:id="6" w:name="_Toc212543682"/>
+      <w:bookmarkStart w:id="7" w:name="_Toc212544445"/>
+      <w:bookmarkStart w:id="8" w:name="_Toc212544453"/>
+      <w:r>
         <w:t xml:space="preserve">Título Nível </w:t>
       </w:r>
       <w:r>
-        <w:rPr>
-          <w:lang w:val="pt-BR"/>
-        </w:rPr>
         <w:t>2</w:t>
       </w:r>
+      <w:bookmarkEnd w:id="5"/>
+      <w:bookmarkEnd w:id="6"/>
+      <w:bookmarkEnd w:id="7"/>
+      <w:bookmarkEnd w:id="8"/>
     </w:p>
     <w:p>
       <w:pPr>
@@ -592,15 +798,19 @@
         <w:ind w:hanging="850"/>
         <w:rPr>
           <w:u w:val="single"/>
-          <w:lang w:val="pt-BR"/>
-        </w:rPr>
-      </w:pPr>
-      <w:r>
-        <w:rPr>
-          <w:lang w:val="pt-BR"/>
-        </w:rPr>
+        </w:rPr>
+      </w:pPr>
+      <w:bookmarkStart w:id="9" w:name="_Toc212543592"/>
+      <w:bookmarkStart w:id="10" w:name="_Toc212543683"/>
+      <w:bookmarkStart w:id="11" w:name="_Toc212544446"/>
+      <w:bookmarkStart w:id="12" w:name="_Toc212544454"/>
+      <w:r>
         <w:t>Título Nível 3</w:t>
       </w:r>
+      <w:bookmarkEnd w:id="9"/>
+      <w:bookmarkEnd w:id="10"/>
+      <w:bookmarkEnd w:id="11"/>
+      <w:bookmarkEnd w:id="12"/>
     </w:p>
     <w:p>
       <w:pPr>
@@ -626,34 +836,42 @@
       <w:pPr>
         <w:pStyle w:val="Ttulo1"/>
       </w:pPr>
-      <w:proofErr w:type="spellStart"/>
+      <w:bookmarkStart w:id="13" w:name="_Toc212543593"/>
+      <w:bookmarkStart w:id="14" w:name="_Toc212543684"/>
+      <w:bookmarkStart w:id="15" w:name="_Toc212544447"/>
+      <w:bookmarkStart w:id="16" w:name="_Toc212544455"/>
       <w:r>
         <w:lastRenderedPageBreak/>
-        <w:t>Título</w:t>
-      </w:r>
-      <w:proofErr w:type="spellEnd"/>
-      <w:r>
-        <w:t xml:space="preserve"> </w:t>
-      </w:r>
-      <w:proofErr w:type="spellStart"/>
-      <w:r>
-        <w:t>Nível</w:t>
-      </w:r>
-      <w:proofErr w:type="spellEnd"/>
-      <w:r>
-        <w:t xml:space="preserve"> 1</w:t>
-      </w:r>
+        <w:t>Título Nível 1</w:t>
+      </w:r>
+      <w:bookmarkEnd w:id="13"/>
+      <w:bookmarkEnd w:id="14"/>
+      <w:bookmarkEnd w:id="15"/>
+      <w:bookmarkEnd w:id="16"/>
     </w:p>
     <w:p>
-      <w:r>
-        <w:t xml:space="preserve">Lorem ipsum dolor sit amet, consectetur adipiscing elit. Duis ultrices commodo consequat. Ut laoreet diam purus, sed dictum nisi facilisis quis. Vivamus tortor odio, finibus sed accumsan ac, sodales a mi. </w:t>
-      </w:r>
-      <w:r>
-        <w:t xml:space="preserve">Aenean vitae ipsum eros. Vestibulum ut mollis lectus. </w:t>
+      <w:pPr>
+        <w:rPr>
+          <w:lang w:val="pt-BR"/>
+        </w:rPr>
+      </w:pPr>
+      <w:r>
+        <w:rPr>
+          <w:lang w:val="pt-BR"/>
+        </w:rPr>
+        <w:t xml:space="preserve">Lorem ipsum dolor sit amet, consectetur adipiscing elit. Duis ultrices commodo consequat. Ut laoreet diam purus, sed dictum nisi facilisis quis. Vivamus tortor odio, finibus sed accumsan ac, sodales a mi. Aenean vitae ipsum eros. Vestibulum ut mollis lectus. </w:t>
       </w:r>
     </w:p>
     <w:p>
-      <w:r>
+      <w:pPr>
+        <w:rPr>
+          <w:lang w:val="pt-BR"/>
+        </w:rPr>
+      </w:pPr>
+      <w:r>
+        <w:rPr>
+          <w:lang w:val="pt-BR"/>
+        </w:rPr>
         <w:t>Ut lacinia augue vel enim dictum imperdiet. Vestibulum id libero vitae sem lacinia posuere ac hendrerit lacus. Donec hendrerit tempor ullamcorper. Vestibulum ante ipsum primis in faucibus orci luctus et ultrices posuere cubilia curae; Aliquam varius urna volutpat, porta eros id, pretium dolor. Fusce ut ligula libero. Sed at finibus diam, ac hendrerit sem. Nunc condimentum, purus in imperdiet finibus, neque enim suscipit ligula, eget vestibulum ante erat ut diam.</w:t>
       </w:r>
     </w:p>
@@ -715,61 +933,95 @@
     <w:p>
       <w:pPr>
         <w:pStyle w:val="Legenda"/>
-      </w:pPr>
-      <w:bookmarkStart w:id="1" w:name="_Toc212498933"/>
-      <w:proofErr w:type="spellStart"/>
-      <w:r>
-        <w:t>Figura</w:t>
-      </w:r>
-      <w:proofErr w:type="spellEnd"/>
-      <w:r>
-        <w:t xml:space="preserve"> </w:t>
-      </w:r>
-      <w:fldSimple w:instr=" SEQ Figura \* ARABIC ">
-        <w:r>
-          <w:t>2</w:t>
-        </w:r>
-        <w:bookmarkEnd w:id="1"/>
-      </w:fldSimple>
+        <w:rPr>
+          <w:lang w:val="pt-BR"/>
+        </w:rPr>
+      </w:pPr>
+      <w:bookmarkStart w:id="17" w:name="_Toc212498933"/>
+      <w:r>
+        <w:rPr>
+          <w:lang w:val="pt-BR"/>
+        </w:rPr>
+        <w:t xml:space="preserve">Figura </w:t>
+      </w:r>
+      <w:r>
+        <w:fldChar w:fldCharType="begin"/>
+      </w:r>
+      <w:r>
+        <w:rPr>
+          <w:lang w:val="pt-BR"/>
+        </w:rPr>
+        <w:instrText xml:space="preserve"> SEQ Figura \* ARABIC </w:instrText>
+      </w:r>
+      <w:r>
+        <w:fldChar w:fldCharType="separate"/>
+      </w:r>
+      <w:r>
+        <w:rPr>
+          <w:lang w:val="pt-BR"/>
+        </w:rPr>
+        <w:t>2</w:t>
+      </w:r>
+      <w:bookmarkEnd w:id="17"/>
+      <w:r>
+        <w:fldChar w:fldCharType="end"/>
+      </w:r>
     </w:p>
     <w:p>
       <w:pPr>
         <w:pStyle w:val="Ttulo2"/>
       </w:pPr>
-      <w:proofErr w:type="spellStart"/>
-      <w:r>
-        <w:t>Título</w:t>
-      </w:r>
-      <w:proofErr w:type="spellEnd"/>
-      <w:r>
-        <w:t xml:space="preserve"> </w:t>
-      </w:r>
-      <w:proofErr w:type="spellStart"/>
-      <w:r>
-        <w:t>Nível</w:t>
-      </w:r>
-      <w:proofErr w:type="spellEnd"/>
-      <w:r>
-        <w:t xml:space="preserve"> 2:</w:t>
-      </w:r>
+      <w:bookmarkStart w:id="18" w:name="_Toc212543594"/>
+      <w:bookmarkStart w:id="19" w:name="_Toc212543685"/>
+      <w:bookmarkStart w:id="20" w:name="_Toc212544448"/>
+      <w:bookmarkStart w:id="21" w:name="_Toc212544456"/>
+      <w:r>
+        <w:t>Título Nível 2:</w:t>
+      </w:r>
+      <w:bookmarkEnd w:id="18"/>
+      <w:bookmarkEnd w:id="19"/>
+      <w:bookmarkEnd w:id="20"/>
+      <w:bookmarkEnd w:id="21"/>
     </w:p>
     <w:p>
-      <w:r>
-        <w:t xml:space="preserve">Lorem ipsum dolor sit amet, consectetur adipiscing elit. Duis ultrices commodo consequat. Ut laoreet diam purus, sed dictum nisi facilisis quis. Vivamus tortor odio, finibus sed accumsan ac, sodales a mi. </w:t>
-      </w:r>
-      <w:r>
-        <w:t xml:space="preserve">Aenean vitae ipsum eros. Vestibulum ut mollis lectus. </w:t>
+      <w:pPr>
+        <w:rPr>
+          <w:lang w:val="pt-BR"/>
+        </w:rPr>
+      </w:pPr>
+      <w:r>
+        <w:rPr>
+          <w:lang w:val="pt-BR"/>
+        </w:rPr>
+        <w:t xml:space="preserve">Lorem ipsum dolor sit amet, consectetur adipiscing elit. Duis ultrices commodo consequat. Ut laoreet diam purus, sed dictum nisi facilisis quis. Vivamus tortor odio, finibus sed accumsan ac, sodales a mi. Aenean vitae ipsum eros. Vestibulum ut mollis lectus. </w:t>
       </w:r>
     </w:p>
     <w:p>
-      <w:r>
+      <w:pPr>
+        <w:rPr>
+          <w:lang w:val="pt-BR"/>
+        </w:rPr>
+      </w:pPr>
+      <w:r>
+        <w:rPr>
+          <w:lang w:val="pt-BR"/>
+        </w:rPr>
         <w:t>Ut lacinia augue vel enim dictum imperdiet. Vestibulum id libero vitae sem lacinia posuere ac hendrerit lacus. Donec hendrerit tempor ullamcorper. Vestibulum ante ipsum primis in faucibus orci luctus et ultrices posuere cubilia curae; Aliquam varius urna volutpat, porta eros id, pretium dolor. Fusce ut ligula libero. Sed at finibus diam, ac hendrerit sem. Nunc condimentum, purus in imperdiet finibus, neque enim suscipit ligula, eget vestibulum ante erat ut diam</w:t>
       </w:r>
       <w:r>
+        <w:rPr>
+          <w:lang w:val="pt-BR"/>
+        </w:rPr>
         <w:t>.</w:t>
       </w:r>
     </w:p>
-    <w:p/>
+    <w:p>
+      <w:pPr>
+        <w:rPr>
+          <w:lang w:val="pt-BR"/>
+        </w:rPr>
+      </w:pPr>
+    </w:p>
     <w:sectPr>
       <w:pgSz w:w="11906" w:h="16838"/>
       <w:pgMar w:top="1440" w:right="1440" w:bottom="1440" w:left="1440" w:header="708" w:footer="708" w:gutter="0"/>
@@ -1278,7 +1530,7 @@
     <w:name w:val="Normal"/>
     <w:next w:val="SemEspaamento"/>
     <w:qFormat/>
-    <w:rsid w:val="00ED4877"/>
+    <w:rsid w:val="00A5346C"/>
     <w:pPr>
       <w:ind w:firstLine="567"/>
       <w:jc w:val="both"/>
@@ -1289,7 +1541,7 @@
   </w:style>
   <w:style w:type="paragraph" w:styleId="Ttulo1">
     <w:name w:val="heading 1"/>
-    <w:basedOn w:val="Normal"/>
+    <w:basedOn w:val="TOC"/>
     <w:next w:val="Normal"/>
     <w:link w:val="Ttulo1Char"/>
     <w:uiPriority w:val="9"/>
@@ -1297,7 +1549,6 @@
     <w:rsid w:val="00ED4877"/>
     <w:pPr>
       <w:keepLines/>
-      <w:ind w:firstLine="0"/>
       <w:outlineLvl w:val="0"/>
     </w:pPr>
     <w:rPr>
@@ -1505,14 +1756,13 @@
     <w:basedOn w:val="Fontepargpadro"/>
     <w:link w:val="Ttulo1"/>
     <w:uiPriority w:val="9"/>
-    <w:rsid w:val="00ED4877"/>
+    <w:rsid w:val="00A76B92"/>
     <w:rPr>
       <w:rFonts w:eastAsiaTheme="majorEastAsia"/>
       <w:b/>
       <w:bCs/>
       <w:sz w:val="28"/>
       <w:szCs w:val="28"/>
-      <w:lang w:val="en-US"/>
     </w:rPr>
   </w:style>
   <w:style w:type="character" w:customStyle="1" w:styleId="Ttulo2Char">
@@ -1520,7 +1770,7 @@
     <w:basedOn w:val="Fontepargpadro"/>
     <w:link w:val="Ttulo2"/>
     <w:uiPriority w:val="9"/>
-    <w:rsid w:val="00C07EE4"/>
+    <w:rsid w:val="00A76B92"/>
     <w:rPr>
       <w:rFonts w:eastAsiaTheme="majorEastAsia"/>
       <w:b/>
@@ -1811,11 +2061,11 @@
     <w:next w:val="Legenda"/>
     <w:link w:val="ImageChar"/>
     <w:qFormat/>
-    <w:rsid w:val="00E5303B"/>
+    <w:rsid w:val="00BA7440"/>
     <w:pPr>
       <w:keepNext/>
       <w:spacing w:before="240" w:after="60" w:line="240" w:lineRule="auto"/>
-      <w:ind w:left="-1134" w:right="-1134" w:hanging="142"/>
+      <w:ind w:left="-1134" w:right="-1134" w:firstLine="0"/>
       <w:jc w:val="center"/>
     </w:pPr>
     <w:rPr>
@@ -1827,7 +2077,7 @@
     <w:name w:val="Image Char"/>
     <w:basedOn w:val="Fontepargpadro"/>
     <w:link w:val="Image"/>
-    <w:rsid w:val="00E5303B"/>
+    <w:rsid w:val="00BA7440"/>
     <w:rPr>
       <w:noProof/>
       <w:sz w:val="20"/>
@@ -1888,6 +2138,127 @@
     </w:pPr>
     <w:rPr>
       <w:noProof/>
+    </w:rPr>
+  </w:style>
+  <w:style w:type="paragraph" w:styleId="Sumrio1">
+    <w:name w:val="toc 1"/>
+    <w:basedOn w:val="TOC"/>
+    <w:next w:val="TOC"/>
+    <w:link w:val="Sumrio1Char"/>
+    <w:autoRedefine/>
+    <w:uiPriority w:val="39"/>
+    <w:unhideWhenUsed/>
+    <w:rsid w:val="00AF1F83"/>
+    <w:pPr>
+      <w:tabs>
+        <w:tab w:val="right" w:leader="dot" w:pos="9016"/>
+      </w:tabs>
+      <w:spacing w:before="360" w:after="100"/>
+    </w:pPr>
+    <w:rPr>
+      <w:b/>
+      <w:noProof/>
+    </w:rPr>
+  </w:style>
+  <w:style w:type="paragraph" w:customStyle="1" w:styleId="TOC">
+    <w:name w:val="TOC"/>
+    <w:basedOn w:val="Normal"/>
+    <w:link w:val="TOCChar"/>
+    <w:qFormat/>
+    <w:rsid w:val="00A76B92"/>
+    <w:pPr>
+      <w:ind w:firstLine="0"/>
+    </w:pPr>
+    <w:rPr>
+      <w:lang w:val="pt-BR"/>
+    </w:rPr>
+  </w:style>
+  <w:style w:type="character" w:customStyle="1" w:styleId="TOCChar">
+    <w:name w:val="TOC Char"/>
+    <w:basedOn w:val="Fontepargpadro"/>
+    <w:link w:val="TOC"/>
+    <w:rsid w:val="00A76B92"/>
+  </w:style>
+  <w:style w:type="paragraph" w:styleId="Sumrio2">
+    <w:name w:val="toc 2"/>
+    <w:basedOn w:val="Normal"/>
+    <w:next w:val="Normal"/>
+    <w:autoRedefine/>
+    <w:uiPriority w:val="39"/>
+    <w:unhideWhenUsed/>
+    <w:rsid w:val="007B172A"/>
+    <w:pPr>
+      <w:tabs>
+        <w:tab w:val="right" w:leader="dot" w:pos="9016"/>
+      </w:tabs>
+      <w:spacing w:after="100"/>
+      <w:ind w:left="240" w:hanging="98"/>
+    </w:pPr>
+  </w:style>
+  <w:style w:type="paragraph" w:styleId="Sumrio3">
+    <w:name w:val="toc 3"/>
+    <w:basedOn w:val="Normal"/>
+    <w:next w:val="Normal"/>
+    <w:autoRedefine/>
+    <w:uiPriority w:val="39"/>
+    <w:unhideWhenUsed/>
+    <w:rsid w:val="007B172A"/>
+    <w:pPr>
+      <w:tabs>
+        <w:tab w:val="right" w:leader="dot" w:pos="9016"/>
+      </w:tabs>
+      <w:spacing w:after="100"/>
+      <w:ind w:left="480" w:hanging="54"/>
+    </w:pPr>
+  </w:style>
+  <w:style w:type="character" w:customStyle="1" w:styleId="Sumrio1Char">
+    <w:name w:val="Sumário 1 Char"/>
+    <w:basedOn w:val="TOCChar"/>
+    <w:link w:val="Sumrio1"/>
+    <w:uiPriority w:val="39"/>
+    <w:rsid w:val="00AF1F83"/>
+    <w:rPr>
+      <w:b/>
+      <w:noProof/>
+    </w:rPr>
+  </w:style>
+  <w:style w:type="paragraph" w:styleId="Sumrio9">
+    <w:name w:val="toc 9"/>
+    <w:basedOn w:val="Normal"/>
+    <w:next w:val="Normal"/>
+    <w:autoRedefine/>
+    <w:uiPriority w:val="39"/>
+    <w:semiHidden/>
+    <w:unhideWhenUsed/>
+    <w:rsid w:val="007B172A"/>
+    <w:pPr>
+      <w:spacing w:after="100"/>
+      <w:ind w:left="1920"/>
+    </w:pPr>
+  </w:style>
+  <w:style w:type="paragraph" w:styleId="CabealhodoSumrio">
+    <w:name w:val="TOC Heading"/>
+    <w:basedOn w:val="Ttulo1"/>
+    <w:next w:val="Normal"/>
+    <w:uiPriority w:val="39"/>
+    <w:unhideWhenUsed/>
+    <w:qFormat/>
+    <w:rsid w:val="00A5346C"/>
+    <w:pPr>
+      <w:keepNext/>
+      <w:spacing w:before="120" w:after="0" w:line="240" w:lineRule="auto"/>
+      <w:jc w:val="left"/>
+      <w:outlineLvl w:val="9"/>
+    </w:pPr>
+    <w:rPr>
+      <w:rFonts w:cstheme="majorBidi"/>
+      <w:bCs w:val="0"/>
+      <w:color w:val="0F4761" w:themeColor="accent1" w:themeShade="BF"/>
+      <w:kern w:val="0"/>
+      <w:sz w:val="32"/>
+      <w:szCs w:val="32"/>
+      <w:lang w:eastAsia="pt-BR"/>
+      <w14:ligatures w14:val="none"/>
     </w:rPr>
   </w:style>
 </w:styles>

</xml_diff>